<commit_message>
IO: etapa 3 — defensa final reenfocada en stock (etapas 1 y 2 en una diapositiva)
Co-Authored-By: Claude Opus 5.5 (1M context) <noreply@anthropic.com>
</commit_message>
<xml_diff>
--- a/materias/IO/entregables/etapa3/IO_402_Grupo1_Etapa3_Guion.docx
+++ b/materias/IO/entregables/etapa3/IO_402_Grupo1_Etapa3_Guion.docx
@@ -26,13 +26,13 @@
       </w:pPr>
       <w:r>
         <w:rPr/>
-        <w:t xml:space="preserve">Juntas de motor: el proyecto completo</w:t>
+        <w:t xml:space="preserve">Juntas de motor: gestión de stock y cierre del proyecto</w:t>
       </w:r>
     </w:p>
     <w:p>
       <w:r>
         <w:rPr/>
-        <w:t xml:space="preserve">Este guion acompaña las 12 diapositivas de la presentación final. Recorre las tres etapas del trabajo y pone el foco en la etapa 3, gestión de stock. Cada integrante tiene dos diapositivas consecutivas y un texto listo para ensayar. Duración orientativa: 11 a 12 minutos, según el ritmo y las pausas.</w:t>
+        <w:t xml:space="preserve">Este guion acompaña las 12 diapositivas de la defensa final. Las etapas 1 y 2 se repasan en una sola diapositiva, como punto de partida; el resto desarrolla la etapa 3, gestión de stock, y cierra con las conclusiones de todo el proyecto. Cada integrante tiene dos diapositivas consecutivas y un texto listo para ensayar. Duración orientativa: 11 a 12 minutos, según el ritmo y las pausas.</w:t>
       </w:r>
     </w:p>
     <w:p>
@@ -243,7 +243,7 @@
                 <w:color w:val="000000"/>
                 <w:sz w:val="20"/>
               </w:rPr>
-              <w:t>1:55 min</w:t>
+              <w:t>1:45 min</w:t>
             </w:r>
           </w:p>
         </w:tc>
@@ -338,7 +338,7 @@
                 <w:color w:val="000000"/>
                 <w:sz w:val="20"/>
               </w:rPr>
-              <w:t>1:55 min</w:t>
+              <w:t>1:50 min</w:t>
             </w:r>
           </w:p>
         </w:tc>
@@ -433,7 +433,7 @@
                 <w:color w:val="000000"/>
                 <w:sz w:val="20"/>
               </w:rPr>
-              <w:t>2:05 min</w:t>
+              <w:t>1:45 min</w:t>
             </w:r>
           </w:p>
         </w:tc>
@@ -718,7 +718,7 @@
                 <w:color w:val="000000"/>
                 <w:sz w:val="20"/>
               </w:rPr>
-              <w:t>1:45 min</w:t>
+              <w:t>1:50 min</w:t>
             </w:r>
           </w:p>
         </w:tc>
@@ -765,7 +765,7 @@
       </w:pPr>
       <w:r>
         <w:rPr/>
-        <w:t xml:space="preserve">El caso y el plan óptimo (etapa 1)</w:t>
+        <w:t xml:space="preserve">Presentación y punto de partida</w:t>
       </w:r>
     </w:p>
     <w:p>
@@ -784,7 +784,7 @@
           <w:color w:val="505050"/>
           <w:sz w:val="20"/>
         </w:rPr>
-        <w:t xml:space="preserve">En pantalla: Presentar el caso y el recorrido de las tres etapas.</w:t>
+        <w:t xml:space="preserve">En pantalla: Presentar el caso y el foco de la defensa.</w:t>
       </w:r>
     </w:p>
     <w:p>
@@ -796,13 +796,13 @@
     <w:p>
       <w:r>
         <w:rPr/>
-        <w:t xml:space="preserve">A lo largo del año trabajamos el caso en tres etapas. En la primera formulamos el modelo lineal y encontramos el plan de producción óptimo. En la segunda analizamos cuánto vale cada recurso y qué decisiones se desprenden de esa solución.</w:t>
+        <w:t xml:space="preserve">En las dos primeras etapas definimos cuánto producir y analizamos ese plan. En esta última etapa pasamos de la producción a las compras: aplicamos tres modelos de gestión de stock para decidir cuánto y cuándo pedir el corcho, nuestro insumo principal.</w:t>
       </w:r>
     </w:p>
     <w:p>
       <w:r>
         <w:rPr/>
-        <w:t xml:space="preserve">En la tercera pasamos de la producción a las compras: definimos cuánto y cuándo pedir el corcho, que es nuestro insumo principal. Vamos a recorrer las tres etapas y cerrar con las conclusiones del proyecto.</w:t>
+        <w:t xml:space="preserve">Primero vamos a recordar brevemente de dónde venimos, después desarrollamos los tres modelos y cerramos con las conclusiones de todo el proyecto.</w:t>
       </w:r>
     </w:p>
     <w:p>
@@ -811,7 +811,7 @@
       </w:pPr>
       <w:r>
         <w:rPr/>
-        <w:t xml:space="preserve">Diapositiva 2   El plan de producción óptimo</w:t>
+        <w:t xml:space="preserve">Diapositiva 2   De dónde venimos</w:t>
       </w:r>
     </w:p>
     <w:p>
@@ -821,25 +821,25 @@
           <w:color w:val="505050"/>
           <w:sz w:val="20"/>
         </w:rPr>
-        <w:t xml:space="preserve">En pantalla: Señalar el plan óptimo y qué restricciones quedan activas.</w:t>
+        <w:t xml:space="preserve">En pantalla: Repasar el plan óptimo y por qué el corcho es el insumo a analizar.</w:t>
       </w:r>
     </w:p>
     <w:p>
       <w:r>
         <w:rPr/>
-        <w:t xml:space="preserve">Las variables son los lotes semanales de cada tipo de junta; cada lote equivale a cien juntas. Maximizamos el beneficio, en miles de pesos, con cuatro restricciones: el corcho disponible, las horas de troquelado, la capacidad de despacho y un mínimo contractual de ciento cincuenta lotes.</w:t>
+        <w:t xml:space="preserve">En la primera etapa formulamos un modelo lineal y lo resolvimos con Simplex. El plan óptimo es fabricar ochenta lotes de tapa de cilindros, veinte de cárter y cincuenta de múltiple por semana, con un beneficio de seis millones seiscientos mil pesos.</w:t>
       </w:r>
     </w:p>
     <w:p>
       <w:r>
         <w:rPr/>
-        <w:t xml:space="preserve">Lo resolvimos con el método Simplex, usando el método de la M grande por la restricción de mayor o igual. El óptimo es fabricar ochenta lotes de tapa de cilindros, veinte de cárter y cincuenta de múltiple, con un beneficio de seis millones seiscientos mil pesos por semana.</w:t>
+        <w:t xml:space="preserve">En la segunda etapa vimos que las horas de máquina y el despacho son los cuellos de botella: una hora más vale veinte mil pesos y un lote más de despacho, treinta mil. El corcho, en cambio, tiene precio sombra cero, porque sobran doscientos setenta metros cuadrados por semana. Ese sobrante lo aprovechamos con pedidos especiales, que suman trescientos cuarenta y cinco mil pesos.</w:t>
       </w:r>
     </w:p>
     <w:p>
       <w:r>
         <w:rPr/>
-        <w:t xml:space="preserve">Lo más importante para lo que sigue es qué recursos se agotan. Las horas de máquina, el despacho y el mínimo contractual quedan justos. El corcho, en cambio, sobra: usamos trescientos treinta de los seiscientos metros cuadrados. Ese consumo y ese sobrante son el hilo del resto del proyecto. Luis sigue con la etapa dos.</w:t>
+        <w:t xml:space="preserve">De ahí sale la etapa tres: el corcho no limita la producción, así que la pregunta deja de ser cuánto tenemos y pasa a ser cómo conviene comprarlo. Luis sigue con eso.</w:t>
       </w:r>
     </w:p>
     <w:p>
@@ -870,7 +870,7 @@
       </w:pPr>
       <w:r>
         <w:rPr/>
-        <w:t xml:space="preserve">Dualidad, sensibilidad y programación entera (etapa 2)</w:t>
+        <w:t xml:space="preserve">El insumo crítico y el planteo del descuento</w:t>
       </w:r>
     </w:p>
     <w:p>
@@ -879,7 +879,7 @@
       </w:pPr>
       <w:r>
         <w:rPr/>
-        <w:t xml:space="preserve">Diapositiva 3   Cuánto vale cada recurso</w:t>
+        <w:t xml:space="preserve">Diapositiva 3   El corcho como insumo crítico</w:t>
       </w:r>
     </w:p>
     <w:p>
@@ -889,25 +889,25 @@
           <w:color w:val="505050"/>
           <w:sz w:val="20"/>
         </w:rPr>
-        <w:t xml:space="preserve">En pantalla: Recorrer los precios sombra y los dos rangos de sensibilidad.</w:t>
+        <w:t xml:space="preserve">En pantalla: Mostrar la demanda anual y la pregunta que responde cada modelo.</w:t>
       </w:r>
     </w:p>
     <w:p>
       <w:r>
         <w:rPr/>
-        <w:t xml:space="preserve">En la segunda etapa planteamos el modelo dual. Sus variables son los precios sombra: el valor de una unidad adicional de cada recurso.</w:t>
+        <w:t xml:space="preserve">Elegimos el corcho porque es la materia prima de las tres juntas y porque, al sobrar, hay margen para replantear la política de compra sin afectar la producción.</w:t>
       </w:r>
     </w:p>
     <w:p>
       <w:r>
         <w:rPr/>
-        <w:t xml:space="preserve">El corcho vale cero, porque ya sobra. Una hora más de máquina aporta veinte mil pesos y un lote más de capacidad de despacho, treinta mil. El mínimo contractual tiene precio sombra negativo: cada lote extra que nos exijan nos cuesta sesenta mil pesos.</w:t>
+        <w:t xml:space="preserve">La demanda sale del plan óptimo: trescientos treinta metros cuadrados por semana, por cincuenta y dos semanas, da diecisiete mil ciento sesenta metros cuadrados al año. Sumamos un segundo insumo, el sellador que usa la bañadora, porque comparte el depósito con el corcho.</w:t>
       </w:r>
     </w:p>
     <w:p>
       <w:r>
         <w:rPr/>
-        <w:t xml:space="preserve">Además calculamos dos rangos de sensibilidad. La ganancia del cárter puede subir hasta cuarenta mil pesos por lote sin que cambie el plan. Las horas de máquina pueden moverse entre cuatrocientas y quinientas por semana manteniendo la misma base: si conseguimos veinte horas más, el beneficio sube cuatrocientos mil pesos y llega a siete millones semanales. Fuera de esos rangos hay que volver a optimizar.</w:t>
+        <w:t xml:space="preserve">Aplicamos tres modelos y cada uno responde una pregunta. El determinístico con descuento por cantidad dice cuánto conviene pedir por costo. El modelo con restricción verifica si ese lote entra en el depósito. Y el aleatorio dice cuándo pedir para no quedarnos sin corcho.</w:t>
       </w:r>
     </w:p>
     <w:p>
@@ -916,7 +916,7 @@
       </w:pPr>
       <w:r>
         <w:rPr/>
-        <w:t xml:space="preserve">Diapositiva 4   Producto nuevo y pedidos especiales</w:t>
+        <w:t xml:space="preserve">Diapositiva 4   Descuento por cantidad: planteo</w:t>
       </w:r>
     </w:p>
     <w:p>
@@ -926,25 +926,25 @@
           <w:color w:val="505050"/>
           <w:sz w:val="20"/>
         </w:rPr>
-        <w:t xml:space="preserve">En pantalla: Contrastar la decisión rechazada con la aceptada.</w:t>
+        <w:t xml:space="preserve">En pantalla: Explicar la función de costo y el criterio de decisión.</w:t>
       </w:r>
     </w:p>
     <w:p>
       <w:r>
         <w:rPr/>
-        <w:t xml:space="preserve">Con esos precios sombra evaluamos dos decisiones. La primera era fabricar un producto nuevo, la junta de bomba de agua, con una ganancia de cuarenta y cinco mil pesos por lote. Valorando los recursos que consume, su costo de oportunidad es de sesenta mil. El costo reducido da menos quince mil: aunque deja ganancia, no conviene, porque desplaza producción que rinde más.</w:t>
+        <w:t xml:space="preserve">El proveedor cobra dos mil quinientos pesos el metro cuadrado, y baja a dos mil trescientos cincuenta si el pedido es de dos mil metros o más. Cada pedido cuesta cuarenta y cinco mil pesos y mantener el stock cuesta el veintiocho por ciento anual del precio.</w:t>
       </w:r>
     </w:p>
     <w:p>
       <w:r>
         <w:rPr/>
-        <w:t xml:space="preserve">La segunda fue aprovechar los doscientos setenta metros cuadrados de corcho sobrante con pedidos especiales de terceros. Como cada pedido se acepta entero o se rechaza, lo planteamos como un problema de mochila binaria y lo resolvimos con Branch and Bound.</w:t>
+        <w:t xml:space="preserve">Como el precio depende del tamaño del lote, en el costo total hay que incluir el costo de compra, además del costo de pedir y el de mantener. Por eso no alcanza con aplicar una vez la fórmula del lote óptimo.</w:t>
       </w:r>
     </w:p>
     <w:p>
       <w:r>
         <w:rPr/>
-        <w:t xml:space="preserve">La relajación dio una cota de trescientos cuarenta y nueve, y el óptimo entero es aceptar los pedidos uno, dos y cuatro: trescientos cuarenta y cinco mil pesos más por semana, usando todo el sobrante. Stéfano sigue con la etapa tres.</w:t>
+        <w:t xml:space="preserve">El procedimiento es el siguiente. Primero calculamos el lote óptimo con el precio con descuento. Si ese lote ya alcanza el umbral, es la solución. Si no, comparamos dos opciones: el lote óptimo al precio normal, y pedir exactamente el mínimo que da el descuento. Nos quedamos con la de menor costo total. Stéfano muestra el resultado.</w:t>
       </w:r>
     </w:p>
     <w:p>
@@ -975,7 +975,7 @@
       </w:pPr>
       <w:r>
         <w:rPr/>
-        <w:t xml:space="preserve">El corcho como insumo crítico y el descuento por cantidad</w:t>
+        <w:t xml:space="preserve">Resultado del descuento y restricción de espacio</w:t>
       </w:r>
     </w:p>
     <w:p>
@@ -984,44 +984,7 @@
       </w:pPr>
       <w:r>
         <w:rPr/>
-        <w:t xml:space="preserve">Diapositiva 5   De la producción a las compras</w:t>
-      </w:r>
-    </w:p>
-    <w:p>
-      <w:r>
-        <w:rPr>
-          <w:i/>
-          <w:color w:val="505050"/>
-          <w:sz w:val="20"/>
-        </w:rPr>
-        <w:t xml:space="preserve">En pantalla: Mostrar la demanda anual y los tres modelos de la etapa.</w:t>
-      </w:r>
-    </w:p>
-    <w:p>
-      <w:r>
-        <w:rPr/>
-        <w:t xml:space="preserve">En la tercera etapa pasamos de cuánto producir a cómo abastecernos. Elegimos el corcho por dos razones: es el insumo principal de las tres juntas y es el único recurso con sobrante, así que hay margen para replantear cuánto y cuándo comprarlo sin afectar la producción.</w:t>
-      </w:r>
-    </w:p>
-    <w:p>
-      <w:r>
-        <w:rPr/>
-        <w:t xml:space="preserve">La demanda sale del plan óptimo: trescientos treinta metros cuadrados por semana, por cincuenta y dos semanas, da diecisiete mil ciento sesenta metros cuadrados al año. También incorporamos el sellador que usa la bañadora, porque comparte el depósito con el corcho.</w:t>
-      </w:r>
-    </w:p>
-    <w:p>
-      <w:r>
-        <w:rPr/>
-        <w:t xml:space="preserve">Aplicamos tres modelos, y cada uno responde una pregunta. El determinístico con descuento dice cuánto conviene pedir por costo. El modelo con restricción verifica si ese lote entra en el depósito. Y el aleatorio dice cuándo pedir para no quedarnos sin corcho.</w:t>
-      </w:r>
-    </w:p>
-    <w:p>
-      <w:pPr>
-        <w:pStyle w:val="Heading2"/>
-      </w:pPr>
-      <w:r>
-        <w:rPr/>
-        <w:t xml:space="preserve">Diapositiva 6   Descuento por cantidad</w:t>
+        <w:t xml:space="preserve">Diapositiva 5   Descuento por cantidad: resultado</w:t>
       </w:r>
     </w:p>
     <w:p>
@@ -1037,25 +1000,56 @@
     <w:p>
       <w:r>
         <w:rPr/>
-        <w:t xml:space="preserve">El proveedor cobra dos mil quinientos pesos el metro cuadrado, pero baja a dos mil trescientos cincuenta si el pedido es de dos mil metros o más. Cada pedido cuesta cuarenta y cinco mil pesos y mantener el stock cuesta el veintiocho por ciento anual del precio.</w:t>
+        <w:t xml:space="preserve">Con el precio con descuento, el lote óptimo da mil quinientos treinta y dos metros cuadrados. No llega a los dos mil, así que el descuento no se gana solo y tenemos que comparar.</w:t>
       </w:r>
     </w:p>
     <w:p>
       <w:r>
         <w:rPr/>
-        <w:t xml:space="preserve">Primero calculamos el lote óptimo con el precio con descuento: da mil quinientos treinta y dos metros cuadrados. Como no llega al umbral de dos mil, el descuento no se gana solo y hay que comparar costos totales.</w:t>
+        <w:t xml:space="preserve">Con el precio normal, el lote óptimo es de mil cuatrocientos ochenta y cinco metros, con un costo anual de casi cuarenta y cuatro millones. Si forzamos el pedido a dos mil metros, pagamos un poco más de mantenimiento, pero ahorramos mucho más en compra: el costo baja a cuarenta y un millones trescientos setenta mil.</w:t>
       </w:r>
     </w:p>
     <w:p>
       <w:r>
         <w:rPr/>
-        <w:t xml:space="preserve">Con el precio normal, el lote óptimo es de mil cuatrocientos ochenta y cinco metros y el costo anual es de casi cuarenta y cuatro millones. Si forzamos el pedido a dos mil metros para acceder al descuento, el costo baja a cuarenta y un millones trescientos setenta mil: un ahorro de unos dos millones quinientos setenta mil pesos por año.</w:t>
+        <w:t xml:space="preserve">Por costo, conviene pedir de a dos mil metros cuadrados: unos ocho pedidos y medio por año, uno cada cuarenta y dos días, con un ahorro de dos millones quinientos setenta mil pesos anuales.</w:t>
+      </w:r>
+    </w:p>
+    <w:p>
+      <w:pPr>
+        <w:pStyle w:val="Heading2"/>
+      </w:pPr>
+      <w:r>
+        <w:rPr/>
+        <w:t xml:space="preserve">Diapositiva 6   La restricción de espacio</w:t>
+      </w:r>
+    </w:p>
+    <w:p>
+      <w:r>
+        <w:rPr>
+          <w:i/>
+          <w:color w:val="505050"/>
+          <w:sz w:val="20"/>
+        </w:rPr>
+        <w:t xml:space="preserve">En pantalla: Plantear el problema restringido y el lagrangiano.</w:t>
       </w:r>
     </w:p>
     <w:p>
       <w:r>
         <w:rPr/>
-        <w:t xml:space="preserve">Pero hay un detalle: dos mil metros cuadrados de corcho ocupan cien metros cúbicos de depósito. Martín va a mostrar qué pasa con eso.</w:t>
+        <w:t xml:space="preserve">Pero ese lote tiene un problema. El corcho y el sellador comparten un depósito de sesenta metros cúbicos, y el corcho ocupa cinco centésimos de metro cúbico por metro cuadrado. Incluso pidiendo cada insumo con su lote óptimo sin descuento, mil cuatrocientos ochenta y cinco metros de corcho y trescientos nueve litros de sellador, necesitamos ochenta coma cuatro metros cúbicos. No entra.</w:t>
+      </w:r>
+    </w:p>
+    <w:p>
+      <w:r>
+        <w:rPr/>
+        <w:t xml:space="preserve">Entonces planteamos el problema con restricción: minimizar el costo de los dos insumos sujeto a que el espacio ocupado no supere sesenta. Lo resolvemos con multiplicadores de Lagrange: sumamos al costo la restricción multiplicada por lambda y derivamos respecto de cada lote.</w:t>
+      </w:r>
+    </w:p>
+    <w:p>
+      <w:r>
+        <w:rPr/>
+        <w:t xml:space="preserve">Queda la misma fórmula del lote óptimo, pero con un término extra en el denominador: dos lambda por el espacio que ocupa cada unidad. Martín muestra cómo encontramos lambda.</w:t>
       </w:r>
     </w:p>
     <w:p>
@@ -1086,7 +1080,7 @@
       </w:pPr>
       <w:r>
         <w:rPr/>
-        <w:t xml:space="preserve">Restricción de depósito y multiplicadores de Lagrange</w:t>
+        <w:t xml:space="preserve">Lagrange y el límite del depósito</w:t>
       </w:r>
     </w:p>
     <w:p>
@@ -1095,7 +1089,7 @@
       </w:pPr>
       <w:r>
         <w:rPr/>
-        <w:t xml:space="preserve">Diapositiva 7   El depósito limita los lotes</w:t>
+        <w:t xml:space="preserve">Diapositiva 7   Iteración del multiplicador λ</w:t>
       </w:r>
     </w:p>
     <w:p>
@@ -1105,25 +1099,31 @@
           <w:color w:val="505050"/>
           <w:sz w:val="20"/>
         </w:rPr>
-        <w:t xml:space="preserve">En pantalla: Mostrar que los lotes libres no entran y cómo λ los ajusta.</w:t>
+        <w:t xml:space="preserve">En pantalla: Recorrer la iteración hasta ocupar exactamente 60 m³.</w:t>
       </w:r>
     </w:p>
     <w:p>
       <w:r>
         <w:rPr/>
-        <w:t xml:space="preserve">El corcho y el sellador comparten un depósito de sesenta metros cúbicos. El corcho ocupa cinco centésimos de metro cúbico por metro cuadrado y el sellador, dos centésimos por litro.</w:t>
+        <w:t xml:space="preserve">Lambda funciona como un costo por usar espacio: cuanto más grande es, más penaliza a los insumos que ocupan lugar y más chicos quedan los lotes. Con lambda igual a cero estamos en el caso sin restricción, que ocupa ochenta coma cuatro metros cúbicos.</w:t>
       </w:r>
     </w:p>
     <w:p>
       <w:r>
         <w:rPr/>
-        <w:t xml:space="preserve">Si pedimos cada insumo con su lote óptimo sin restricción, mil cuatrocientos ochenta y cinco metros de corcho y trescientos nueve litros de sellador, necesitamos ochenta coma cuatro metros cúbicos. No entra, así que la restricción es efectiva y la resolvemos con multiplicadores de Lagrange.</w:t>
+        <w:t xml:space="preserve">Fuimos subiendo lambda. Con tres mil, el espacio baja a sesenta y siete coma siete; todavía no alcanza. Con cinco mil ochocientos veinte, el espacio queda exactamente en sesenta: ese es el lambda óptimo.</w:t>
       </w:r>
     </w:p>
     <w:p>
       <w:r>
         <w:rPr/>
-        <w:t xml:space="preserve">El multiplicador lambda se suma al costo de mantener cada insumo en proporción al espacio que ocupa. Fuimos subiendo lambda hasta que el espacio usado quedó exactamente en sesenta: eso pasa con lambda igual a cinco mil ochocientos veinte pesos por metro cúbico. Los lotes óptimos quedan en mil noventa y ocho metros cuadrados de corcho y doscientos cincuenta y cinco litros de sellador, un veintiséis y un diecisiete por ciento menos que sin restricción.</w:t>
+        <w:t xml:space="preserve">Los lotes quedan en mil noventa y ocho metros cuadrados de corcho y doscientos cincuenta y cinco litros de sellador, un veintiséis y un diecisiete por ciento menos que sin restricción. El corcho baja más porque ocupa más espacio por unidad.</w:t>
+      </w:r>
+    </w:p>
+    <w:p>
+      <w:r>
+        <w:rPr/>
+        <w:t xml:space="preserve">Lambda además tiene lectura económica: cinco mil ochocientos veinte pesos por año es lo que nos ahorraríamos por cada metro cúbico adicional de depósito, en el margen.</w:t>
       </w:r>
     </w:p>
     <w:p>
@@ -1148,19 +1148,19 @@
     <w:p>
       <w:r>
         <w:rPr/>
-        <w:t xml:space="preserve">Si juntamos los dos modelos aparece la conclusión clave de la etapa: el lote de dos mil metros que pedía el descuento ocupa cien metros cúbicos, y el depósito tiene sesenta. Con la infraestructura actual el descuento no se puede aprovechar, y por eso la política correcta es la del modelo restringido, pagando el precio normal.</w:t>
+        <w:t xml:space="preserve">Si juntamos los dos modelos aparece la conclusión clave de la etapa. El lote de dos mil metros que pedía el descuento ocupa cien metros cúbicos, y el depósito tiene sesenta. Con la infraestructura actual el descuento no se puede aprovechar, y la política correcta es la del modelo restringido, pagando el precio normal.</w:t>
       </w:r>
     </w:p>
     <w:p>
       <w:r>
         <w:rPr/>
-        <w:t xml:space="preserve">Lambda nos da el valor del espacio: cinco mil ochocientos veinte pesos por año por cada metro cúbico adicional, en el margen. Pero para llegar al descuento no alcanza con un metro más: hay que ampliar el depósito a unos ciento seis metros cúbicos, cuarenta y seis más que hoy.</w:t>
+        <w:t xml:space="preserve">Para llegar al descuento hay que ampliar el depósito a unos ciento seis metros cúbicos, cuarenta y seis más que hoy. Con esa ampliación, el costo anual conjunto baja de cuarenta y seis millones trescientos mil a cuarenta y tres millones setecientos mil pesos: un ahorro de unos dos millones seiscientos mil por año.</w:t>
       </w:r>
     </w:p>
     <w:p>
       <w:r>
         <w:rPr/>
-        <w:t xml:space="preserve">Con esa ampliación, el costo anual conjunto baja de cuarenta y seis millones trescientos mil a cuarenta y tres millones setecientos mil pesos: un ahorro de unos dos millones seiscientos mil por año. Ampliar conviene si cuesta menos de cincuenta y seis mil setecientos cincuenta pesos por metro cúbico y por año.</w:t>
+        <w:t xml:space="preserve">Entonces ampliar conviene si cuesta menos de cincuenta y seis mil setecientos cincuenta pesos por metro cúbico y por año. Es bastante más que lambda, porque además de espacio la ampliación habilita el salto de precio del descuento. Agustín sigue con el modelo aleatorio.</w:t>
       </w:r>
     </w:p>
     <w:p>
@@ -1191,7 +1191,7 @@
       </w:pPr>
       <w:r>
         <w:rPr/>
-        <w:t xml:space="preserve">Modelo aleatorio y política de compra</w:t>
+        <w:t xml:space="preserve">Modelo aleatorio: stock de seguridad</w:t>
       </w:r>
     </w:p>
     <w:p>
@@ -1200,7 +1200,7 @@
       </w:pPr>
       <w:r>
         <w:rPr/>
-        <w:t xml:space="preserve">Diapositiva 9   Demanda variable: stock de seguridad</w:t>
+        <w:t xml:space="preserve">Diapositiva 9   Demanda variable: planteo</w:t>
       </w:r>
     </w:p>
     <w:p>
@@ -1210,31 +1210,25 @@
           <w:color w:val="505050"/>
           <w:sz w:val="20"/>
         </w:rPr>
-        <w:t xml:space="preserve">En pantalla: Construir el stock de seguridad y el punto de pedido.</w:t>
+        <w:t xml:space="preserve">En pantalla: Explicar la demanda durante el plazo de entrega.</w:t>
       </w:r>
     </w:p>
     <w:p>
       <w:r>
         <w:rPr/>
-        <w:t xml:space="preserve">Hasta acá supusimos una demanda constante, pero el consumo de corcho varía semana a semana según el mix de juntas que se vende. Por eso aplicamos un modelo aleatorio.</w:t>
+        <w:t xml:space="preserve">Hasta acá supusimos una demanda constante, pero el consumo de corcho varía según el mix de juntas que se vende cada semana. Si pedimos justo cuando el stock alcanza para el plazo de entrega promedio, en la mitad de los ciclos nos quedaríamos sin corcho.</w:t>
       </w:r>
     </w:p>
     <w:p>
       <w:r>
         <w:rPr/>
-        <w:t xml:space="preserve">La demanda diaria media es de cuarenta y siete metros cuadrados, con un desvío de ocho. El proveedor tarda diez días en entregar. Durante ese plazo, la demanda esperada es de cuatrocientos setenta metros cuadrados y su desvío es ocho por raíz de diez, unos veinticinco metros.</w:t>
+        <w:t xml:space="preserve">La demanda diaria media es de cuarenta y siete metros cuadrados, con un desvío de ocho, y el proveedor tarda diez días en entregar. Suponemos demanda normal y plazo constante, así que la demanda durante el plazo también es normal, con media de cuatrocientos setenta metros cuadrados y desvío de ocho por raíz de diez, unos veinticinco metros.</w:t>
       </w:r>
     </w:p>
     <w:p>
       <w:r>
         <w:rPr/>
-        <w:t xml:space="preserve">Aceptamos un riesgo de faltante del cinco por ciento, que en la distribución normal corresponde a zeta igual a uno coma seiscientos cuarenta y cinco. El stock de seguridad es zeta por el desvío: cuarenta y dos metros cuadrados. Y el punto de pedido es la demanda esperada más ese colchón: quinientos doce metros cuadrados.</w:t>
-      </w:r>
-    </w:p>
-    <w:p>
-      <w:r>
-        <w:rPr/>
-        <w:t xml:space="preserve">Si pidiéramos justo a cuatrocientos setenta, sin colchón, nos quedaríamos sin corcho en la mitad de los ciclos.</w:t>
+        <w:t xml:space="preserve">Para cubrir esa variabilidad agregamos un stock de seguridad proporcional al desvío. El factor zeta depende del riesgo de faltante que aceptamos: tomamos cinco por ciento, que corresponde a zeta igual a uno coma seiscientos cuarenta y cinco.</w:t>
       </w:r>
     </w:p>
     <w:p>
@@ -1243,7 +1237,7 @@
       </w:pPr>
       <w:r>
         <w:rPr/>
-        <w:t xml:space="preserve">Diapositiva 10   La política de compra del corcho</w:t>
+        <w:t xml:space="preserve">Diapositiva 10   Stock de seguridad y punto de pedido</w:t>
       </w:r>
     </w:p>
     <w:p>
@@ -1253,25 +1247,25 @@
           <w:color w:val="505050"/>
           <w:sz w:val="20"/>
         </w:rPr>
-        <w:t xml:space="preserve">En pantalla: Leer la regla de compra y la tabla resumen.</w:t>
+        <w:t xml:space="preserve">En pantalla: Mostrar el resultado y cómo cambia con el riesgo aceptado.</w:t>
       </w:r>
     </w:p>
     <w:p>
       <w:r>
         <w:rPr/>
-        <w:t xml:space="preserve">Juntando los tres modelos, la política de compra del corcho queda así: cada vez que el stock disponible, contando lo que ya está pedido, baja a quinientos doce metros cuadrados, se pide un lote de mil noventa y ocho.</w:t>
+        <w:t xml:space="preserve">El stock de seguridad es zeta por el desvío: uno coma seiscientos cuarenta y cinco por veinticinco coma tres, cuarenta y dos metros cuadrados. Y el punto de pedido es la demanda esperada más ese colchón: quinientos doce metros cuadrados.</w:t>
       </w:r>
     </w:p>
     <w:p>
       <w:r>
         <w:rPr/>
-        <w:t xml:space="preserve">Eso da unos quince pedidos y medio por año, uno cada veintitrés días aproximadamente, y asegura no quedarnos sin corcho durante la entrega en el noventa y cinco por ciento de los ciclos. El sellador se pide en lotes de doscientos cincuenta y cinco litros.</w:t>
+        <w:t xml:space="preserve">En la tabla se ve que el riesgo aceptado es una decisión de la empresa. Con un diez por ciento de riesgo, el colchón baja a treinta y dos metros; si queremos solo un uno por ciento, sube a cincuenta y nueve. Cada punto de riesgo que se reduce cuesta más stock que el anterior.</w:t>
       </w:r>
     </w:p>
     <w:p>
       <w:r>
         <w:rPr/>
-        <w:t xml:space="preserve">En la tabla se ve el resumen: el lote de dos mil metros queda como referencia, porque requiere ampliar el depósito. El stock de seguridad solo corresponde al modelo aleatorio, porque en los determinísticos la demanda se conoce con certeza. Gonzalo cierra con las conclusiones del proyecto.</w:t>
+        <w:t xml:space="preserve">Elegimos cinco por ciento como equilibrio. El lote que se pide sigue siendo el del modelo restringido: en este modelo la aleatoriedad afecta cuándo pedir, no cuánto. Gonzalo cierra con la política de compra y las conclusiones.</w:t>
       </w:r>
     </w:p>
     <w:p>
@@ -1302,7 +1296,7 @@
       </w:pPr>
       <w:r>
         <w:rPr/>
-        <w:t xml:space="preserve">Decisiones y conclusiones del proyecto</w:t>
+        <w:t xml:space="preserve">Política de compra y conclusiones</w:t>
       </w:r>
     </w:p>
     <w:p>
@@ -1311,7 +1305,7 @@
       </w:pPr>
       <w:r>
         <w:rPr/>
-        <w:t xml:space="preserve">Diapositiva 11   Del modelo a las decisiones</w:t>
+        <w:t xml:space="preserve">Diapositiva 11   La política de compra del corcho</w:t>
       </w:r>
     </w:p>
     <w:p>
@@ -1321,25 +1315,25 @@
           <w:color w:val="505050"/>
           <w:sz w:val="20"/>
         </w:rPr>
-        <w:t xml:space="preserve">En pantalla: Recorrer las decisiones de cada etapa y su impacto.</w:t>
+        <w:t xml:space="preserve">En pantalla: Leer la regla de compra y la tabla resumen.</w:t>
       </w:r>
     </w:p>
     <w:p>
       <w:r>
         <w:rPr/>
-        <w:t xml:space="preserve">Para cerrar, resumimos qué decisiones concretas le deja el proyecto a la empresa. De la primera etapa, el plan de producción: ochenta, veinte y cincuenta lotes, con seis millones seiscientos mil pesos semanales.</w:t>
+        <w:t xml:space="preserve">Juntando los tres modelos, la política de compra del corcho queda así: cada vez que el stock disponible, contando lo que ya está pedido, baja a quinientos doce metros cuadrados, se pide un lote de mil noventa y ocho.</w:t>
       </w:r>
     </w:p>
     <w:p>
       <w:r>
         <w:rPr/>
-        <w:t xml:space="preserve">De la segunda, tres decisiones. Ampliar horas de máquina o despacho solo si cuestan menos que su precio sombra, veinte mil pesos la hora y treinta mil el lote. No incorporar la junta de bomba de agua. Y aceptar los pedidos especiales uno, dos y cuatro, que suman trescientos cuarenta y cinco mil pesos por semana.</w:t>
+        <w:t xml:space="preserve">Eso da unos quince pedidos y medio por año, uno cada veintitrés días, con un noventa y cinco por ciento de ciclos sin faltante. El sellador se pide en lotes de doscientos cincuenta y cinco litros.</w:t>
       </w:r>
     </w:p>
     <w:p>
       <w:r>
         <w:rPr/>
-        <w:t xml:space="preserve">De la tercera, la política de compra: pedir mil noventa y ocho metros cuadrados de corcho al llegar a quinientos doce, y evaluar la ampliación del depósito, que habilitaría el descuento y un ahorro de unos dos millones seiscientos mil pesos por año si su costo es razonable.</w:t>
+        <w:t xml:space="preserve">En la tabla está el resumen de los lotes. El de dos mil metros queda como referencia, porque requiere ampliar el depósito. El stock de seguridad solo corresponde al modelo aleatorio, porque en los determinísticos la demanda se conoce con certeza.</w:t>
       </w:r>
     </w:p>
     <w:p>
@@ -1358,31 +1352,31 @@
           <w:color w:val="505050"/>
           <w:sz w:val="20"/>
         </w:rPr>
-        <w:t xml:space="preserve">En pantalla: Cerrar con las tres conclusiones del proyecto.</w:t>
+        <w:t xml:space="preserve">En pantalla: Cerrar con las conclusiones de las tres etapas.</w:t>
       </w:r>
     </w:p>
     <w:p>
       <w:r>
         <w:rPr/>
-        <w:t xml:space="preserve">La principal conclusión es que el modelo no termina en un número. El plan óptimo nos dijo cuánto producir, pero también qué recursos son cuello de botella y cuánto vale aflojarlos.</w:t>
+        <w:t xml:space="preserve">Para cerrar, las conclusiones del proyecto completo. En producción, el plan óptimo deja seis millones seiscientos mil pesos semanales. Las horas de máquina y el despacho son los cuellos de botella, y ampliarlos conviene solo si cuesta menos que su precio sombra. El corcho sobrante se aprovecha con pedidos especiales.</w:t>
       </w:r>
     </w:p>
     <w:p>
       <w:r>
         <w:rPr/>
-        <w:t xml:space="preserve">El análisis de sensibilidad y dualidad nos permitió evaluar cambios y oportunidades sin resolver todo de nuevo, y descartar una idea que parecía buena, como la junta de bomba de agua.</w:t>
+        <w:t xml:space="preserve">En compras, la restricción que manda es el depósito y no el precio: pedimos lotes de mil noventa y ocho metros cuadrados, con cuarenta y dos de stock de seguridad.</w:t>
       </w:r>
     </w:p>
     <w:p>
       <w:r>
         <w:rPr/>
-        <w:t xml:space="preserve">Y la gestión de stock mostró que, en las compras, la restricción que manda es el depósito y no el precio: el descuento solo es aprovechable si se amplía el espacio.</w:t>
+        <w:t xml:space="preserve">Y queda una decisión abierta para la empresa: ampliar el depósito, que habilitaría el descuento y un ahorro de unos dos millones seiscientos mil pesos por año, si cuesta menos de cincuenta y seis mil setecientos cincuenta por metro cúbico.</w:t>
       </w:r>
     </w:p>
     <w:p>
       <w:r>
         <w:rPr/>
-        <w:t xml:space="preserve">En conjunto, la fábrica puede mejorar su rentabilidad por varios frentes a la vez, producción, capacidad, pedidos especiales y compras, sin depender de un único cambio drástico. Muchas gracias.</w:t>
+        <w:t xml:space="preserve">En conjunto, el proyecto muestra que la fábrica puede mejorar su rentabilidad por varios frentes a la vez, sin depender de un único cambio drástico. Muchas gracias.</w:t>
       </w:r>
     </w:p>
     <w:p>
@@ -1428,6 +1422,20 @@
       <w:r>
         <w:rPr/>
         <w:t xml:space="preserve">Partimos del plan base de la etapa 1. Si además se aceptan los pedidos, el consumo sube a 600 m² por semana (31.200 m² al año). En ese caso el lote con descuento da 2.066 m² y el descuento se ganaría solo por costo, pero el depósito sigue limitando el corcho a unos 1.117 m². La conclusión de fondo no cambia: manda el espacio.</w:t>
+      </w:r>
+    </w:p>
+    <w:p>
+      <w:r>
+        <w:rPr>
+          <w:b/>
+        </w:rPr>
+        <w:t xml:space="preserve">¿Por qué en el descuento se compara con exactamente 2.000 m² y no con un lote mayor?</w:t>
+      </w:r>
+    </w:p>
+    <w:p>
+      <w:r>
+        <w:rPr/>
+        <w:t xml:space="preserve">Con el precio con descuento el costo total es convexo y tiene su mínimo en Q₂* = 1.532 m². Para lotes de 2.000 m² o más, el costo crece a medida que el lote se aleja de ese mínimo, así que el mejor lote con descuento es el propio umbral.</w:t>
       </w:r>
     </w:p>
     <w:p>

</xml_diff>